<commit_message>
chore: Edited the report
</commit_message>
<xml_diff>
--- a/docs/report_content_IT23271364.docx
+++ b/docs/report_content_IT23271364.docx
@@ -1198,7 +1198,6 @@
     </w:p>
     <w:p/>
     <w:p>
-      <w:proofErr w:type="spellStart"/>
       <w:r>
         <w:rPr>
           <w:b/>
@@ -1206,7 +1205,6 @@
         </w:rPr>
         <w:t>Respect_Index</w:t>
       </w:r>
-      <w:proofErr w:type="spellEnd"/>
       <w:r>
         <w:rPr>
           <w:b/>
@@ -1378,7 +1376,6 @@
       </w:r>
     </w:p>
     <w:p>
-      <w:proofErr w:type="spellStart"/>
       <w:r>
         <w:rPr>
           <w:b/>
@@ -1386,7 +1383,6 @@
         </w:rPr>
         <w:t>WorkLifeBalance</w:t>
       </w:r>
-      <w:proofErr w:type="spellEnd"/>
       <w:r>
         <w:rPr>
           <w:b/>
@@ -1502,7 +1498,6 @@
       </w:r>
     </w:p>
     <w:p>
-      <w:proofErr w:type="spellStart"/>
       <w:r>
         <w:rPr>
           <w:b/>
@@ -1510,7 +1505,6 @@
         </w:rPr>
         <w:t>JobLevel</w:t>
       </w:r>
-      <w:proofErr w:type="spellEnd"/>
       <w:r>
         <w:rPr>
           <w:b/>
@@ -2417,6 +2411,9 @@
     <w:p/>
     <w:p>
       <w:r>
+        <w:rPr>
+          <w:noProof/>
+        </w:rPr>
         <w:drawing>
           <wp:anchor distT="0" distB="0" distL="114300" distR="114300" simplePos="0" relativeHeight="251677696" behindDoc="1" locked="0" layoutInCell="1" allowOverlap="1" wp14:anchorId="00BA5CEF" wp14:editId="6A01E210">
             <wp:simplePos x="0" y="0"/>
@@ -2582,6 +2579,9 @@
     </w:p>
     <w:p>
       <w:r>
+        <w:rPr>
+          <w:noProof/>
+        </w:rPr>
         <w:drawing>
           <wp:anchor distT="0" distB="0" distL="114300" distR="114300" simplePos="0" relativeHeight="251678720" behindDoc="1" locked="0" layoutInCell="1" allowOverlap="1" wp14:anchorId="56221863" wp14:editId="541F71F3">
             <wp:simplePos x="0" y="0"/>
@@ -2734,6 +2734,7 @@
         <w:rPr>
           <w:b/>
           <w:bCs/>
+          <w:noProof/>
         </w:rPr>
         <w:drawing>
           <wp:anchor distT="0" distB="0" distL="114300" distR="114300" simplePos="0" relativeHeight="251679744" behindDoc="1" locked="0" layoutInCell="1" allowOverlap="1" wp14:anchorId="23E01126" wp14:editId="7711E9B8">
@@ -2800,13 +2801,7 @@
         </w:numPr>
       </w:pPr>
       <w:r>
-        <w:t>MSE: SLR model - 1.158779: Average squared error of actual and predictions</w:t>
-      </w:r>
-      <w:r>
-        <w:t xml:space="preserve">, </w:t>
-      </w:r>
-      <w:r>
-        <w:t>MLR - 1.163834: Worse than SLR</w:t>
+        <w:t>MSE: SLR model - 1.158779: Average squared error of actual and predictions, MLR - 1.163834: Worse than SLR</w:t>
       </w:r>
     </w:p>
     <w:p>
@@ -2818,13 +2813,7 @@
         </w:numPr>
       </w:pPr>
       <w:r>
-        <w:t>RMSE: SLR - 1.076466: Models prediction is off by 1.08 points a large error as the scale is 1-4</w:t>
-      </w:r>
-      <w:r>
-        <w:t xml:space="preserve">, </w:t>
-      </w:r>
-      <w:r>
-        <w:t>MLR - 1.078812: Same as above</w:t>
+        <w:t>RMSE: SLR - 1.076466: Models prediction is off by 1.08 points a large error as the scale is 1-4, MLR - 1.078812: Same as above</w:t>
       </w:r>
       <w:r>
         <w:t xml:space="preserve">. </w:t>
@@ -3698,6 +3687,320 @@
       </w:tr>
     </w:tbl>
     <w:p/>
+    <w:p>
+      <w:pPr>
+        <w:rPr>
+          <w:b/>
+          <w:bCs/>
+        </w:rPr>
+      </w:pPr>
+      <w:r>
+        <w:rPr>
+          <w:b/>
+          <w:bCs/>
+        </w:rPr>
+        <w:t>The Final Verdict</w:t>
+      </w:r>
+    </w:p>
+    <w:tbl>
+      <w:tblPr>
+        <w:tblW w:w="0" w:type="auto"/>
+        <w:tblCellSpacing w:w="15" w:type="dxa"/>
+        <w:tblCellMar>
+          <w:top w:w="15" w:type="dxa"/>
+          <w:left w:w="15" w:type="dxa"/>
+          <w:bottom w:w="15" w:type="dxa"/>
+          <w:right w:w="15" w:type="dxa"/>
+        </w:tblCellMar>
+        <w:tblLook w:val="04A0" w:firstRow="1" w:lastRow="0" w:firstColumn="1" w:lastColumn="0" w:noHBand="0" w:noVBand="1"/>
+      </w:tblPr>
+      <w:tblGrid>
+        <w:gridCol w:w="6205"/>
+        <w:gridCol w:w="1496"/>
+        <w:gridCol w:w="1325"/>
+      </w:tblGrid>
+      <w:tr>
+        <w:trPr>
+          <w:tblHeader/>
+          <w:tblCellSpacing w:w="15" w:type="dxa"/>
+        </w:trPr>
+        <w:tc>
+          <w:tcPr>
+            <w:tcW w:w="0" w:type="auto"/>
+            <w:vAlign w:val="center"/>
+            <w:hideMark/>
+          </w:tcPr>
+          <w:p>
+            <w:pPr>
+              <w:rPr>
+                <w:b/>
+                <w:bCs/>
+              </w:rPr>
+            </w:pPr>
+            <w:r>
+              <w:rPr>
+                <w:b/>
+                <w:bCs/>
+              </w:rPr>
+              <w:t>Claim</w:t>
+            </w:r>
+          </w:p>
+        </w:tc>
+        <w:tc>
+          <w:tcPr>
+            <w:tcW w:w="0" w:type="auto"/>
+            <w:vAlign w:val="center"/>
+            <w:hideMark/>
+          </w:tcPr>
+          <w:p>
+            <w:pPr>
+              <w:rPr>
+                <w:b/>
+                <w:bCs/>
+              </w:rPr>
+            </w:pPr>
+            <w:r>
+              <w:rPr>
+                <w:b/>
+                <w:bCs/>
+              </w:rPr>
+              <w:t>Verdict</w:t>
+            </w:r>
+          </w:p>
+        </w:tc>
+        <w:tc>
+          <w:tcPr>
+            <w:tcW w:w="0" w:type="auto"/>
+            <w:vAlign w:val="center"/>
+            <w:hideMark/>
+          </w:tcPr>
+          <w:p>
+            <w:pPr>
+              <w:rPr>
+                <w:b/>
+                <w:bCs/>
+              </w:rPr>
+            </w:pPr>
+            <w:r>
+              <w:rPr>
+                <w:b/>
+                <w:bCs/>
+              </w:rPr>
+              <w:t>Strength</w:t>
+            </w:r>
+          </w:p>
+        </w:tc>
+      </w:tr>
+      <w:tr>
+        <w:trPr>
+          <w:tblCellSpacing w:w="15" w:type="dxa"/>
+        </w:trPr>
+        <w:tc>
+          <w:tcPr>
+            <w:tcW w:w="0" w:type="auto"/>
+            <w:vAlign w:val="center"/>
+            <w:hideMark/>
+          </w:tcPr>
+          <w:p>
+            <w:r>
+              <w:t xml:space="preserve">No public dataset oriented for respect </w:t>
+            </w:r>
+            <w:r>
+              <w:rPr>
+                <w:rFonts w:ascii="Times New Roman" w:hAnsi="Times New Roman" w:cs="Times New Roman"/>
+              </w:rPr>
+              <w:t>→</w:t>
+            </w:r>
+            <w:r>
+              <w:t xml:space="preserve"> job satisfaction</w:t>
+            </w:r>
+          </w:p>
+        </w:tc>
+        <w:tc>
+          <w:tcPr>
+            <w:tcW w:w="0" w:type="auto"/>
+            <w:vAlign w:val="center"/>
+            <w:hideMark/>
+          </w:tcPr>
+          <w:p>
+            <w:r>
+              <w:rPr>
+                <w:rFonts w:ascii="Segoe UI Emoji" w:hAnsi="Segoe UI Emoji" w:cs="Segoe UI Emoji"/>
+              </w:rPr>
+              <w:t>✅</w:t>
+            </w:r>
+            <w:r>
+              <w:t xml:space="preserve"> Confirmed</w:t>
+            </w:r>
+          </w:p>
+        </w:tc>
+        <w:tc>
+          <w:tcPr>
+            <w:tcW w:w="0" w:type="auto"/>
+            <w:vAlign w:val="center"/>
+            <w:hideMark/>
+          </w:tcPr>
+          <w:p>
+            <w:r>
+              <w:t>Strong</w:t>
+            </w:r>
+          </w:p>
+        </w:tc>
+      </w:tr>
+      <w:tr>
+        <w:trPr>
+          <w:tblCellSpacing w:w="15" w:type="dxa"/>
+        </w:trPr>
+        <w:tc>
+          <w:tcPr>
+            <w:tcW w:w="0" w:type="auto"/>
+            <w:vAlign w:val="center"/>
+            <w:hideMark/>
+          </w:tcPr>
+          <w:p>
+            <w:r>
+              <w:t>IBM is highest quality synthetic dataset with JobSatisfaction</w:t>
+            </w:r>
+          </w:p>
+        </w:tc>
+        <w:tc>
+          <w:tcPr>
+            <w:tcW w:w="0" w:type="auto"/>
+            <w:vAlign w:val="center"/>
+            <w:hideMark/>
+          </w:tcPr>
+          <w:p>
+            <w:r>
+              <w:rPr>
+                <w:rFonts w:ascii="Segoe UI Emoji" w:hAnsi="Segoe UI Emoji" w:cs="Segoe UI Emoji"/>
+              </w:rPr>
+              <w:t>✅</w:t>
+            </w:r>
+            <w:r>
+              <w:t xml:space="preserve"> Confirmed</w:t>
+            </w:r>
+          </w:p>
+        </w:tc>
+        <w:tc>
+          <w:tcPr>
+            <w:tcW w:w="0" w:type="auto"/>
+            <w:vAlign w:val="center"/>
+            <w:hideMark/>
+          </w:tcPr>
+          <w:p>
+            <w:r>
+              <w:t>Strong</w:t>
+            </w:r>
+          </w:p>
+        </w:tc>
+      </w:tr>
+      <w:tr>
+        <w:trPr>
+          <w:tblCellSpacing w:w="15" w:type="dxa"/>
+        </w:trPr>
+        <w:tc>
+          <w:tcPr>
+            <w:tcW w:w="0" w:type="auto"/>
+            <w:vAlign w:val="center"/>
+            <w:hideMark/>
+          </w:tcPr>
+          <w:p>
+            <w:r>
+              <w:t>IBM is the only one where Respect_Index could be built contextually</w:t>
+            </w:r>
+          </w:p>
+        </w:tc>
+        <w:tc>
+          <w:tcPr>
+            <w:tcW w:w="0" w:type="auto"/>
+            <w:vAlign w:val="center"/>
+            <w:hideMark/>
+          </w:tcPr>
+          <w:p>
+            <w:r>
+              <w:rPr>
+                <w:rFonts w:ascii="Segoe UI Emoji" w:hAnsi="Segoe UI Emoji" w:cs="Segoe UI Emoji"/>
+              </w:rPr>
+              <w:t>✅</w:t>
+            </w:r>
+            <w:r>
+              <w:t xml:space="preserve"> Confirmed</w:t>
+            </w:r>
+          </w:p>
+        </w:tc>
+        <w:tc>
+          <w:tcPr>
+            <w:tcW w:w="0" w:type="auto"/>
+            <w:vAlign w:val="center"/>
+            <w:hideMark/>
+          </w:tcPr>
+          <w:p>
+            <w:r>
+              <w:t>Strong</w:t>
+            </w:r>
+          </w:p>
+        </w:tc>
+      </w:tr>
+      <w:tr>
+        <w:trPr>
+          <w:tblCellSpacing w:w="15" w:type="dxa"/>
+        </w:trPr>
+        <w:tc>
+          <w:tcPr>
+            <w:tcW w:w="0" w:type="auto"/>
+            <w:vAlign w:val="center"/>
+            <w:hideMark/>
+          </w:tcPr>
+          <w:p>
+            <w:r>
+              <w:t>Feature choices were the most compatible available</w:t>
+            </w:r>
+          </w:p>
+        </w:tc>
+        <w:tc>
+          <w:tcPr>
+            <w:tcW w:w="0" w:type="auto"/>
+            <w:vAlign w:val="center"/>
+            <w:hideMark/>
+          </w:tcPr>
+          <w:p>
+            <w:r>
+              <w:rPr>
+                <w:rFonts w:ascii="Segoe UI Emoji" w:hAnsi="Segoe UI Emoji" w:cs="Segoe UI Emoji"/>
+              </w:rPr>
+              <w:t>✅</w:t>
+            </w:r>
+            <w:r>
+              <w:t xml:space="preserve"> Confirmed</w:t>
+            </w:r>
+          </w:p>
+        </w:tc>
+        <w:tc>
+          <w:tcPr>
+            <w:tcW w:w="0" w:type="auto"/>
+            <w:vAlign w:val="center"/>
+            <w:hideMark/>
+          </w:tcPr>
+          <w:p>
+            <w:r>
+              <w:t>Reasonable</w:t>
+            </w:r>
+          </w:p>
+        </w:tc>
+      </w:tr>
+    </w:tbl>
+    <w:p>
+      <w:r>
+        <w:rPr>
+          <w:b/>
+          <w:bCs/>
+        </w:rPr>
+        <w:t>You can state this confidently in your report:</w:t>
+      </w:r>
+      <w:r>
+        <w:t xml:space="preserve"> Given the absence of any publicly available dataset explicitly capturing perceived workplace respect alongside job satisfaction, and given that existing proprietary research data (SHRM, Gallup, Pew) remains inaccessible for academic use, the IBM HR Attrition dataset represents the only viable public option that simultaneously contains JobSatisfaction as a target and the relational/developmental features necessary to engineer a contextually valid Respect_Index.</w:t>
+      </w:r>
+    </w:p>
     <w:p/>
     <w:p>
       <w:pPr>
@@ -7377,7 +7680,6 @@
   <w:style w:type="character" w:default="1" w:styleId="DefaultParagraphFont">
     <w:name w:val="Default Paragraph Font"/>
     <w:uiPriority w:val="1"/>
-    <w:semiHidden/>
     <w:unhideWhenUsed/>
   </w:style>
   <w:style w:type="table" w:default="1" w:styleId="TableNormal">

</xml_diff>